<commit_message>
Update seizure motion with facts from 23.9.2026 request and registrar decision
Co-Authored-By: Claude Opus 5.5 <noreply@anthropic.com>
Claude-Session: https://claude.ai/code/session_01Hw25hza7HExUu1k9xwEj12
</commit_message>
<xml_diff>
--- a/execution-seizure-release/בקשה_דחופה_להסרת_עיקול.docx
+++ b/execution-seizure-release/בקשה_דחופה_להסרת_עיקול.docx
@@ -17,7 +17,18 @@
           <w:szCs w:val="24"/>
           <w:rtl/>
         </w:rPr>
-        <w:t xml:space="preserve">בבית המשפט לענייני משפחה ב[___]</w:t>
+        <w:t xml:space="preserve">בבית המשפט לענייני משפחה בראשון לציון</w:t>
+      </w:r>
+      <w:r>
+        <w:rPr>
+          <w:rFonts w:ascii="David" w:cs="David" w:eastAsia="David" w:hAnsi="David"/>
+          <w:b/>
+          <w:bCs/>
+          <w:sz w:val="24"/>
+          <w:szCs w:val="24"/>
+          <w:rtl/>
+        </w:rPr>
+        <w:t xml:space="preserve">			תמ"ש 49199-09-23</w:t>
       </w:r>
     </w:p>
     <w:p>
@@ -29,19 +40,35 @@
       <w:r>
         <w:rPr>
           <w:rFonts w:ascii="David" w:cs="David" w:eastAsia="David" w:hAnsi="David"/>
+          <w:sz w:val="24"/>
+          <w:szCs w:val="24"/>
+          <w:rtl/>
+        </w:rPr>
+        <w:t xml:space="preserve">בפני כב' השופטת מירב אליהו</w:t>
+      </w:r>
+    </w:p>
+    <w:p>
+      <w:pPr>
+        <w:bidi/>
+      </w:pPr>
+    </w:p>
+    <w:p>
+      <w:pPr>
+        <w:bidi/>
+        <w:spacing w:after="0"/>
+        <w:jc w:val="start"/>
+      </w:pPr>
+      <w:r>
+        <w:rPr>
+          <w:rFonts w:ascii="David" w:cs="David" w:eastAsia="David" w:hAnsi="David"/>
           <w:b/>
           <w:bCs/>
           <w:sz w:val="24"/>
           <w:szCs w:val="24"/>
           <w:rtl/>
         </w:rPr>
-        <w:t xml:space="preserve">תמ"ש [___]</w:t>
-      </w:r>
-    </w:p>
-    <w:p>
-      <w:pPr>
-        <w:bidi/>
-      </w:pPr>
+        <w:t xml:space="preserve">המבקש:		[שם המבקש], ת.ז. [___]</w:t>
+      </w:r>
     </w:p>
     <w:p>
       <w:pPr>
@@ -56,7 +83,7 @@
           <w:szCs w:val="24"/>
           <w:rtl/>
         </w:rPr>
-        <w:t xml:space="preserve">המבקש:	[שם המבקש], ת.ז. [___]</w:t>
+        <w:t xml:space="preserve">		ע"י ב"כ עו"ד סולומון טקה</w:t>
       </w:r>
     </w:p>
     <w:p>
@@ -94,6 +121,8 @@
       <w:r>
         <w:rPr>
           <w:rFonts w:ascii="David" w:cs="David" w:eastAsia="David" w:hAnsi="David"/>
+          <w:b/>
+          <w:bCs/>
           <w:sz w:val="24"/>
           <w:szCs w:val="24"/>
           <w:rtl/>
@@ -110,6 +139,8 @@
       <w:r>
         <w:rPr>
           <w:rFonts w:ascii="David" w:cs="David" w:eastAsia="David" w:hAnsi="David"/>
+          <w:b/>
+          <w:bCs/>
           <w:sz w:val="24"/>
           <w:szCs w:val="24"/>
           <w:rtl/>
@@ -138,23 +169,23 @@
           <w:u w:val="single"/>
           <w:rtl/>
         </w:rPr>
-        <w:t xml:space="preserve">בקשה דחופה למתן הוראות - הסרת עיקול בתיק הוצאה לפועל 542780-03-25</w:t>
-      </w:r>
-    </w:p>
-    <w:p>
-      <w:pPr>
-        <w:bidi/>
-        <w:spacing w:after="120" w:line="360" w:lineRule="auto"/>
-        <w:jc w:val="both"/>
-      </w:pPr>
-      <w:r>
-        <w:rPr>
-          <w:rFonts w:ascii="David" w:cs="David" w:eastAsia="David" w:hAnsi="David"/>
-          <w:sz w:val="24"/>
-          <w:szCs w:val="24"/>
-          <w:rtl/>
-        </w:rPr>
-        <w:t xml:space="preserve">בית המשפט הנכבד מתבקש להורות כי עיכוב ההליכים שניתן בהחלטותיו מיום 19.8.2026 ומיום 17.9.2026 חל גם על העיקול שהוטל ביום 14.4.2026 על חשבון הבנק של המבקש, ולהורות על הסרתו ועל שחרור מיידי של כספי המבקש המעוכבים בו.</w:t>
+        <w:t xml:space="preserve">בקשה דחופה למתן הוראות - הסרת עיקול, השבת כספים והפסקת הגדלת החוב בתיק הוצאה לפועל 542780-03-25</w:t>
+      </w:r>
+    </w:p>
+    <w:p>
+      <w:pPr>
+        <w:bidi/>
+        <w:spacing w:after="120" w:line="360" w:lineRule="auto"/>
+        <w:jc w:val="both"/>
+      </w:pPr>
+      <w:r>
+        <w:rPr>
+          <w:rFonts w:ascii="David" w:cs="David" w:eastAsia="David" w:hAnsi="David"/>
+          <w:sz w:val="24"/>
+          <w:szCs w:val="24"/>
+          <w:rtl/>
+        </w:rPr>
+        <w:t xml:space="preserve">בית המשפט הנכבד מתבקש להורות כי עיכוב ההליכים שניתן בהחלטותיו מיום 19.8.2026 ומיום 17.9.2026 חל גם על העיקול שהוטל על חשבון הבנק של המבקש, ולהורות על הסרתו, על השבת הכספים שנגבו בניגוד לעיכוב ועל הפסקת הגדלת החוב בתיק.</w:t>
       </w:r>
     </w:p>
     <w:p>
@@ -191,154 +222,175 @@
           <w:szCs w:val="24"/>
           <w:rtl/>
         </w:rPr>
-        <w:t xml:space="preserve">פסק הדין מיום 24.12.2023, שעל בסיסו נפתח תיק ההוצאה לפועל, בוטל ביום 12.5.2026.</w:t>
-      </w:r>
-    </w:p>
-    <w:p>
-      <w:pPr>
-        <w:pStyle w:val="ListParagraph"/>
-        <w:numPr>
-          <w:ilvl w:val="0"/>
-          <w:numId w:val="2"/>
-        </w:numPr>
-        <w:bidi/>
-        <w:spacing w:after="120" w:line="360" w:lineRule="auto"/>
-        <w:jc w:val="both"/>
-      </w:pPr>
-      <w:r>
-        <w:rPr>
-          <w:rFonts w:ascii="David" w:cs="David" w:eastAsia="David" w:hAnsi="David"/>
-          <w:sz w:val="24"/>
-          <w:szCs w:val="24"/>
-          <w:rtl/>
-        </w:rPr>
-        <w:t xml:space="preserve">ביום 14.4.2026 הוטל בתיק עיקול לשלושה חודשים על חשבון הבנק של המבקש בבנק הפועלים, סניף 652, חשבון מס' 456899. זהו חשבונו היחיד של המבקש, ואליו נכנסת משכורתו.</w:t>
-      </w:r>
-    </w:p>
-    <w:p>
-      <w:pPr>
-        <w:pStyle w:val="ListParagraph"/>
-        <w:numPr>
-          <w:ilvl w:val="0"/>
-          <w:numId w:val="2"/>
-        </w:numPr>
-        <w:bidi/>
-        <w:spacing w:after="120" w:line="360" w:lineRule="auto"/>
-        <w:jc w:val="both"/>
-      </w:pPr>
-      <w:r>
-        <w:rPr>
-          <w:rFonts w:ascii="David" w:cs="David" w:eastAsia="David" w:hAnsi="David"/>
-          <w:sz w:val="24"/>
-          <w:szCs w:val="24"/>
-          <w:rtl/>
-        </w:rPr>
-        <w:t xml:space="preserve">תקופת העיקול הסתיימה ביום 14.7.2026, והעיקול לא חודש. אף על פי כן החשבון מוקפא עד היום: סך של 8,685 ₪ מעוכב בו, וגם המשכורות שנכנסות לחשבון מוקפאות.</w:t>
-      </w:r>
-    </w:p>
-    <w:p>
-      <w:pPr>
-        <w:pStyle w:val="ListParagraph"/>
-        <w:numPr>
-          <w:ilvl w:val="0"/>
-          <w:numId w:val="2"/>
-        </w:numPr>
-        <w:bidi/>
-        <w:spacing w:after="120" w:line="360" w:lineRule="auto"/>
-        <w:jc w:val="both"/>
-      </w:pPr>
-      <w:r>
-        <w:rPr>
-          <w:rFonts w:ascii="David" w:cs="David" w:eastAsia="David" w:hAnsi="David"/>
-          <w:sz w:val="24"/>
-          <w:szCs w:val="24"/>
-          <w:rtl/>
-        </w:rPr>
-        <w:t xml:space="preserve">ביום 19.8.2026 וביום 17.9.2026 הורה בית המשפט הנכבד על עיכוב ההליכים בתיק.</w:t>
-      </w:r>
-    </w:p>
-    <w:p>
-      <w:pPr>
-        <w:pStyle w:val="ListParagraph"/>
-        <w:numPr>
-          <w:ilvl w:val="0"/>
-          <w:numId w:val="2"/>
-        </w:numPr>
-        <w:bidi/>
-        <w:spacing w:after="120" w:line="360" w:lineRule="auto"/>
-        <w:jc w:val="both"/>
-      </w:pPr>
-      <w:r>
-        <w:rPr>
-          <w:rFonts w:ascii="David" w:cs="David" w:eastAsia="David" w:hAnsi="David"/>
-          <w:sz w:val="24"/>
-          <w:szCs w:val="24"/>
-          <w:rtl/>
-        </w:rPr>
-        <w:t xml:space="preserve">ביום 24.9.2026 דחתה כב' הרשמת מרים סגל את בקשת המבקש לביטול ההליכים, קבעה כי ההליכים מעוכבים מכוח החלטות בית המשפט הנכבד, והפנתה את המבקש אליהן (העתק ההחלטה מצורף כנספח א').</w:t>
-      </w:r>
-    </w:p>
-    <w:p>
-      <w:pPr>
-        <w:pStyle w:val="ListParagraph"/>
-        <w:numPr>
-          <w:ilvl w:val="0"/>
-          <w:numId w:val="2"/>
-        </w:numPr>
-        <w:bidi/>
-        <w:spacing w:after="120" w:line="360" w:lineRule="auto"/>
-        <w:jc w:val="both"/>
-      </w:pPr>
-      <w:r>
-        <w:rPr>
-          <w:rFonts w:ascii="David" w:cs="David" w:eastAsia="David" w:hAnsi="David"/>
-          <w:sz w:val="24"/>
-          <w:szCs w:val="24"/>
-          <w:rtl/>
-        </w:rPr>
-        <w:t xml:space="preserve">ראש ההוצאה לפועל רואה עצמו כפוף להחלטות בית המשפט הנכבד ואינו נכון להרחיבן. ההכרעה בגורל העיקול נתונה אפוא לבית המשפט הנכבד בלבד.</w:t>
-      </w:r>
-    </w:p>
-    <w:p>
-      <w:pPr>
-        <w:pStyle w:val="ListParagraph"/>
-        <w:numPr>
-          <w:ilvl w:val="0"/>
-          <w:numId w:val="2"/>
-        </w:numPr>
-        <w:bidi/>
-        <w:spacing w:after="120" w:line="360" w:lineRule="auto"/>
-        <w:jc w:val="both"/>
-      </w:pPr>
-      <w:r>
-        <w:rPr>
-          <w:rFonts w:ascii="David" w:cs="David" w:eastAsia="David" w:hAnsi="David"/>
-          <w:sz w:val="24"/>
-          <w:szCs w:val="24"/>
-          <w:rtl/>
-        </w:rPr>
-        <w:t xml:space="preserve">המבקש נותר ללא יכולת לקיים את עצמו. כל כספיו, לרבות משכורתו השוטפת, מוקפאים, ואין בידו לרכוש מזון, תרופות וצרכים הכרחיים אחרים. הכנסתו החודשית כ-9,000 ₪, הוצאותיו ההכרחיות כ-7,500 ₪, ואין לו מקור מימון אחר. שכר הדירה אינו משולם, הוראות הקבע חוזרות והחובות מצטברים.</w:t>
-      </w:r>
-    </w:p>
-    <w:p>
-      <w:pPr>
-        <w:pStyle w:val="ListParagraph"/>
-        <w:numPr>
-          <w:ilvl w:val="0"/>
-          <w:numId w:val="2"/>
-        </w:numPr>
-        <w:bidi/>
-        <w:spacing w:after="120" w:line="360" w:lineRule="auto"/>
-        <w:jc w:val="both"/>
-      </w:pPr>
-      <w:r>
-        <w:rPr>
-          <w:rFonts w:ascii="David" w:cs="David" w:eastAsia="David" w:hAnsi="David"/>
-          <w:sz w:val="24"/>
-          <w:szCs w:val="24"/>
-          <w:rtl/>
-        </w:rPr>
-        <w:t xml:space="preserve">עיכוב הליכים ללא הסרת העיקול הוא עיכוב ריק מתוכן. ההליכים קפואים, אך כספי המבקש כלואים. המשיב 2 מחזיק בבטוחה מלאה בלי לשאת בנטל כלשהו, והמבקש נושא בכל נזקי ההליך בלי שנקבע כלפיו חוב סופי.</w:t>
+        <w:t xml:space="preserve">פסק הדין למזונות מיום 24.12.2023, שניתן נגד המבקש במעמד צד אחד בעת ששירת במילואים, ושעל בסיסו נפתח תיק ההוצאה לפועל, בוטל ביום 12.5.2026.</w:t>
+      </w:r>
+    </w:p>
+    <w:p>
+      <w:pPr>
+        <w:pStyle w:val="ListParagraph"/>
+        <w:numPr>
+          <w:ilvl w:val="0"/>
+          <w:numId w:val="2"/>
+        </w:numPr>
+        <w:bidi/>
+        <w:spacing w:after="120" w:line="360" w:lineRule="auto"/>
+        <w:jc w:val="both"/>
+      </w:pPr>
+      <w:r>
+        <w:rPr>
+          <w:rFonts w:ascii="David" w:cs="David" w:eastAsia="David" w:hAnsi="David"/>
+          <w:sz w:val="24"/>
+          <w:szCs w:val="24"/>
+          <w:rtl/>
+        </w:rPr>
+        <w:t xml:space="preserve">ביום 14.4.2026 הוטל בתיק עיקול לשלושה חודשים על חשבון הבנק המשותף למבקש ולרעייתו בבנק הפועלים, סניף 768, חשבון מס' 474964, שאליו נכנסת משכורתו של המבקש. תקופת העיקול הסתיימה ביום 14.7.2026, והעיקול לא חודש.</w:t>
+      </w:r>
+    </w:p>
+    <w:p>
+      <w:pPr>
+        <w:pStyle w:val="ListParagraph"/>
+        <w:numPr>
+          <w:ilvl w:val="0"/>
+          <w:numId w:val="2"/>
+        </w:numPr>
+        <w:bidi/>
+        <w:spacing w:after="120" w:line="360" w:lineRule="auto"/>
+        <w:jc w:val="both"/>
+      </w:pPr>
+      <w:r>
+        <w:rPr>
+          <w:rFonts w:ascii="David" w:cs="David" w:eastAsia="David" w:hAnsi="David"/>
+          <w:sz w:val="24"/>
+          <w:szCs w:val="24"/>
+          <w:rtl/>
+        </w:rPr>
+        <w:t xml:space="preserve">ביום 19.8.2026 וביום 17.9.2026 הורה בית המשפט הנכבד על עיכוב ההליכים בתיק ההוצאה לפועל. החלטת העיכוב נמסרה לזוכה כפי שהורה בית המשפט הנכבד.</w:t>
+      </w:r>
+    </w:p>
+    <w:p>
+      <w:pPr>
+        <w:pStyle w:val="ListParagraph"/>
+        <w:numPr>
+          <w:ilvl w:val="0"/>
+          <w:numId w:val="2"/>
+        </w:numPr>
+        <w:bidi/>
+        <w:spacing w:after="120" w:line="360" w:lineRule="auto"/>
+        <w:jc w:val="both"/>
+      </w:pPr>
+      <w:r>
+        <w:rPr>
+          <w:rFonts w:ascii="David" w:cs="David" w:eastAsia="David" w:hAnsi="David"/>
+          <w:sz w:val="24"/>
+          <w:szCs w:val="24"/>
+          <w:rtl/>
+        </w:rPr>
+        <w:t xml:space="preserve">אף על פי כן, ביום 15.9.2026, כחודש לאחר מתן העיכוב, מומש העיקול ונגבה מהחשבון לתיק סך של 8,869 ₪. החשבון חסום כליל עד היום, והמבקש אינו יכול למשוך ממנו דבר.</w:t>
+      </w:r>
+    </w:p>
+    <w:p>
+      <w:pPr>
+        <w:pStyle w:val="ListParagraph"/>
+        <w:numPr>
+          <w:ilvl w:val="0"/>
+          <w:numId w:val="2"/>
+        </w:numPr>
+        <w:bidi/>
+        <w:spacing w:after="120" w:line="360" w:lineRule="auto"/>
+        <w:jc w:val="both"/>
+      </w:pPr>
+      <w:r>
+        <w:rPr>
+          <w:rFonts w:ascii="David" w:cs="David" w:eastAsia="David" w:hAnsi="David"/>
+          <w:sz w:val="24"/>
+          <w:szCs w:val="24"/>
+          <w:rtl/>
+        </w:rPr>
+        <w:t xml:space="preserve">ביום 22.9.2026 אף הוגדלה קרן החוב בתיק בסך של 3,431 ₪, ויתרת החוב עומדת כיום על 101,996 ₪, לעומת חוב מקורי של 52,728 ₪.</w:t>
+      </w:r>
+    </w:p>
+    <w:p>
+      <w:pPr>
+        <w:pStyle w:val="ListParagraph"/>
+        <w:numPr>
+          <w:ilvl w:val="0"/>
+          <w:numId w:val="2"/>
+        </w:numPr>
+        <w:bidi/>
+        <w:spacing w:after="120" w:line="360" w:lineRule="auto"/>
+        <w:jc w:val="both"/>
+      </w:pPr>
+      <w:r>
+        <w:rPr>
+          <w:rFonts w:ascii="David" w:cs="David" w:eastAsia="David" w:hAnsi="David"/>
+          <w:sz w:val="24"/>
+          <w:szCs w:val="24"/>
+          <w:rtl/>
+        </w:rPr>
+        <w:t xml:space="preserve">ביום 23.9.2026 הגיש המבקש לראש ההוצאה לפועל בקשה דחופה ליישום החלטת העיכוב, להשבת הכספים ולהפסקת הגדלת החוב. ביום 24.9.2026 דחתה כב' הרשמת מרים סגל את הבקשה, קבעה כי ההליכים בתיק מעוכבים על פי החלטות בית המשפט הנכבד, והפנתה את המבקש אליהן (הבקשה וההחלטה מצורפות כנספח א').</w:t>
+      </w:r>
+    </w:p>
+    <w:p>
+      <w:pPr>
+        <w:pStyle w:val="ListParagraph"/>
+        <w:numPr>
+          <w:ilvl w:val="0"/>
+          <w:numId w:val="2"/>
+        </w:numPr>
+        <w:bidi/>
+        <w:spacing w:after="120" w:line="360" w:lineRule="auto"/>
+        <w:jc w:val="both"/>
+      </w:pPr>
+      <w:r>
+        <w:rPr>
+          <w:rFonts w:ascii="David" w:cs="David" w:eastAsia="David" w:hAnsi="David"/>
+          <w:sz w:val="24"/>
+          <w:szCs w:val="24"/>
+          <w:rtl/>
+        </w:rPr>
+        <w:t xml:space="preserve">ראש ההוצאה לפועל רואה עצמו כפוף להחלטות בית המשפט הנכבד ואינו נכון להרחיבן. ההכרעה בגורל העיקול, הכספים שנגבו והגדלת החוב נתונה אפוא לבית המשפט הנכבד בלבד.</w:t>
+      </w:r>
+    </w:p>
+    <w:p>
+      <w:pPr>
+        <w:pStyle w:val="ListParagraph"/>
+        <w:numPr>
+          <w:ilvl w:val="0"/>
+          <w:numId w:val="2"/>
+        </w:numPr>
+        <w:bidi/>
+        <w:spacing w:after="120" w:line="360" w:lineRule="auto"/>
+        <w:jc w:val="both"/>
+      </w:pPr>
+      <w:r>
+        <w:rPr>
+          <w:rFonts w:ascii="David" w:cs="David" w:eastAsia="David" w:hAnsi="David"/>
+          <w:sz w:val="24"/>
+          <w:szCs w:val="24"/>
+          <w:rtl/>
+        </w:rPr>
+        <w:t xml:space="preserve">המבקש ומשפחתו חנוקים כלכלית. החשבון שאליו נכנסת משכורתו חסום, ואין בידו לרכוש מזון, תרופות וצרכים הכרחיים אחרים, ואף לא לתדלק את רכבו. הכנסתו החודשית כ-9,000 ₪, הוצאותיו ההכרחיות כ-7,500 ₪, ואין לו מקור מימון אחר. הוא נאלץ להתקיים מהלוואות מבני משפחתו, שכר הדירה אינו משולם, הוראות הקבע חוזרות והחובות מצטברים.</w:t>
+      </w:r>
+    </w:p>
+    <w:p>
+      <w:pPr>
+        <w:pStyle w:val="ListParagraph"/>
+        <w:numPr>
+          <w:ilvl w:val="0"/>
+          <w:numId w:val="2"/>
+        </w:numPr>
+        <w:bidi/>
+        <w:spacing w:after="120" w:line="360" w:lineRule="auto"/>
+        <w:jc w:val="both"/>
+      </w:pPr>
+      <w:r>
+        <w:rPr>
+          <w:rFonts w:ascii="David" w:cs="David" w:eastAsia="David" w:hAnsi="David"/>
+          <w:sz w:val="24"/>
+          <w:szCs w:val="24"/>
+          <w:rtl/>
+        </w:rPr>
+        <w:t xml:space="preserve">עיכוב הליכים שאינו חל על העיקול, על הגבייה ועל הגדלת החוב הוא עיכוב ריק מתוכן. ההליכים קפואים על הנייר, אך בפועל נגבים כספים מהמבקש והחוב ממשיך לתפוח. הגדלת קרן החוב בתקופת העיכוב היא עצמה פעולת ביצוע. המשיב 2 מחזיק בבטוחה מלאה בלי לשאת בנטל כלשהו, והמבקש נושא בכל נזקי ההליך בלי שנקבע כלפיו חוב סופי.</w:t>
       </w:r>
     </w:p>
     <w:p>
@@ -380,7 +432,7 @@
           <w:szCs w:val="24"/>
           <w:rtl/>
         </w:rPr>
-        <w:t xml:space="preserve">העיקול אף מיצה את עצמו. הוא הוטל לשלושה חודשים ולא חודש, והחזקת כספי המבקש מאז 14.7.2026 אינה נשענת על החלטה בתוקף. ככל שייקבע כי העיקול עודנו בתוקף, הרי שהוא חוסה תחת עיכוב ההליכים שהורה עליו בית המשפט הנכבד. בשני המקרים אין הצדקה להמשך הקפאת החשבון.</w:t>
+        <w:t xml:space="preserve">הגבייה מיום 15.9.2026 פסולה משני טעמים עצמאיים: היא בוצעה מכוח עיקול שתקופתו הסתיימה ביום 14.7.2026 ולא חודש, והיא בוצעה לאחר שבית המשפט הנכבד הורה על עיכוב ההליכים. דינם של הכספים שנגבו להיות מושבים.</w:t>
       </w:r>
     </w:p>
     <w:p>
@@ -464,7 +516,7 @@
           <w:szCs w:val="24"/>
           <w:rtl/>
         </w:rPr>
-        <w:t xml:space="preserve">להורות כי העיכוב חל גם על העיקול מיום 14.4.2026, ולהורות לראש ההוצאה לפועל ולבנק להסירו ולשחרר לאלתר את כספי המבקש המעוכבים.</w:t>
+        <w:t xml:space="preserve">להורות כי העיכוב חל גם על העיקול בחשבון, ולהורות לראש ההוצאה לפועל ולבנק להסירו לאלתר.</w:t>
       </w:r>
     </w:p>
     <w:p>
@@ -485,7 +537,7 @@
           <w:szCs w:val="24"/>
           <w:rtl/>
         </w:rPr>
-        <w:t xml:space="preserve">לחלופין, ועד להכרעה בבקשה, להורות על שחרור מיידי של הכספים המעוכבים לצורכי מחיה הכרחיים של המבקש.</w:t>
+        <w:t xml:space="preserve">להורות על השבת סך 8,869 ₪ שנגבה מהחשבון ביום 15.9.2026.</w:t>
       </w:r>
     </w:p>
     <w:p>
@@ -506,7 +558,7 @@
           <w:szCs w:val="24"/>
           <w:rtl/>
         </w:rPr>
-        <w:t xml:space="preserve">לחלופין, להורות על שחרור החשבון כנגד בטוחה חלופית כמפורט בסעיף 12 לעיל.</w:t>
+        <w:t xml:space="preserve">להורות על הפסקת הגדלת החוב בתקופת העיכוב ועל ביטול כל תוספת לחוב, לרבות אגרות והוצאות, שנרשמה מיום 19.8.2026.</w:t>
       </w:r>
     </w:p>
     <w:p>
@@ -527,7 +579,49 @@
           <w:szCs w:val="24"/>
           <w:rtl/>
         </w:rPr>
-        <w:t xml:space="preserve">להורות כי בתקופת העיכוב לא יוטלו בתיק עיקולים חדשים.</w:t>
+        <w:t xml:space="preserve">להורות כי בתקופת העיכוב לא יוטלו בתיק עיקולים חדשים ולא יינקטו בו פעולות גבייה.</w:t>
+      </w:r>
+    </w:p>
+    <w:p>
+      <w:pPr>
+        <w:pStyle w:val="ListParagraph"/>
+        <w:numPr>
+          <w:ilvl w:val="1"/>
+          <w:numId w:val="2"/>
+        </w:numPr>
+        <w:bidi/>
+        <w:spacing w:after="120" w:line="360" w:lineRule="auto"/>
+        <w:jc w:val="both"/>
+      </w:pPr>
+      <w:r>
+        <w:rPr>
+          <w:rFonts w:ascii="David" w:cs="David" w:eastAsia="David" w:hAnsi="David"/>
+          <w:sz w:val="24"/>
+          <w:szCs w:val="24"/>
+          <w:rtl/>
+        </w:rPr>
+        <w:t xml:space="preserve">לחלופין, ועד להכרעה בבקשה, להורות על שחרור מיידי של כספים לצורכי מחיה הכרחיים של המבקש.</w:t>
+      </w:r>
+    </w:p>
+    <w:p>
+      <w:pPr>
+        <w:pStyle w:val="ListParagraph"/>
+        <w:numPr>
+          <w:ilvl w:val="1"/>
+          <w:numId w:val="2"/>
+        </w:numPr>
+        <w:bidi/>
+        <w:spacing w:after="120" w:line="360" w:lineRule="auto"/>
+        <w:jc w:val="both"/>
+      </w:pPr>
+      <w:r>
+        <w:rPr>
+          <w:rFonts w:ascii="David" w:cs="David" w:eastAsia="David" w:hAnsi="David"/>
+          <w:sz w:val="24"/>
+          <w:szCs w:val="24"/>
+          <w:rtl/>
+        </w:rPr>
+        <w:t xml:space="preserve">לחלופין, להורות על שחרור החשבון כנגד בטוחה חלופית כמפורט בסעיף 13 לעיל.</w:t>
       </w:r>
     </w:p>
     <w:p>
@@ -601,11 +695,30 @@
       <w:r>
         <w:rPr>
           <w:rFonts w:ascii="David" w:cs="David" w:eastAsia="David" w:hAnsi="David"/>
-          <w:sz w:val="24"/>
-          <w:szCs w:val="24"/>
-          <w:rtl/>
-        </w:rPr>
-        <w:t xml:space="preserve">[שם המבקש]</w:t>
+          <w:b/>
+          <w:bCs/>
+          <w:sz w:val="24"/>
+          <w:szCs w:val="24"/>
+          <w:rtl/>
+        </w:rPr>
+        <w:t xml:space="preserve">סולומון טקה, עו"ד</w:t>
+      </w:r>
+    </w:p>
+    <w:p>
+      <w:pPr>
+        <w:bidi/>
+        <w:jc w:val="end"/>
+      </w:pPr>
+      <w:r>
+        <w:rPr>
+          <w:rFonts w:ascii="David" w:cs="David" w:eastAsia="David" w:hAnsi="David"/>
+          <w:b/>
+          <w:bCs/>
+          <w:sz w:val="24"/>
+          <w:szCs w:val="24"/>
+          <w:rtl/>
+        </w:rPr>
+        <w:t xml:space="preserve">ב"כ המבקש</w:t>
       </w:r>
     </w:p>
     <w:p>

</xml_diff>

<commit_message>
Attribute stay correctly: court decision of 18.8.2026, registrar decisions of 19.8 and 17.9
Co-Authored-By: Claude Opus 5.5 <noreply@anthropic.com>
Claude-Session: https://claude.ai/code/session_01Hw25hza7HExUu1k9xwEj12
</commit_message>
<xml_diff>
--- a/execution-seizure-release/בקשה_דחופה_להסרת_עיקול.docx
+++ b/execution-seizure-release/בקשה_דחופה_להסרת_עיקול.docx
@@ -111,7 +111,7 @@
           <w:szCs w:val="24"/>
           <w:rtl/>
         </w:rPr>
-        <w:t xml:space="preserve">בית המשפט הנכבד מתבקש להורות כי עיכוב ההליכים שבהחלטותיו מיום 19.8.2026 ומיום 17.9.2026 חל גם על העיקול בחשבון המבקש, על הגבייה ועל הגדלת החוב, כמפורט להלן:</w:t>
+        <w:t xml:space="preserve">בית המשפט הנכבד מתבקש להורות כי עיכוב ההליכים שעליו הורה בהחלטתו מיום 18.8.2026 (בקשה מס' 13) חל גם על העיקול בחשבון המבקש, על הגבייה ועל הגדלת החוב, כמפורט להלן:</w:t>
       </w:r>
     </w:p>
     <w:p>
@@ -153,7 +153,7 @@
           <w:szCs w:val="24"/>
           <w:rtl/>
         </w:rPr>
-        <w:t xml:space="preserve">ביום 14.4.2026 הוטל עיקול לשלושה חודשים על חשבון המבקש בבנק הפועלים (סניף 768, חשבון 474964), שאליו נכנסת משכורתו. העיקול פקע ביום 14.7.2026 ולא חודש.</w:t>
+        <w:t xml:space="preserve">ביום 14.4.2026 הוטל עיקול לשלושה חודשים על חשבון המבקש בבנק הפועלים (סניף 768, חשבון 474964), שאליו נכנסת משכורתו. העיקול פקע ביום 14.7.2026 ולא חודש. ביום 18.8.2026 הורה בית המשפט הנכבד על עיכוב ההליכים בתיק, והרשמת יישמה זאת בהחלטותיה מיום 19.8.2026 ומיום 17.9.2026.</w:t>
       </w:r>
     </w:p>
     <w:p>
@@ -195,7 +195,7 @@
           <w:szCs w:val="24"/>
           <w:rtl/>
         </w:rPr>
-        <w:t xml:space="preserve">ביום 24.9.2026 דחתה כב' הרשמת מרים סגל את בקשת המבקש, קבעה כי ההליכים מעוכבים מכוח החלטות בית המשפט הנכבד והפנתה אותו אליהן (נספח א'). ההכרעה נתונה אפוא לבית המשפט הנכבד בלבד.</w:t>
+        <w:t xml:space="preserve">ביום 24.9.2026 דחתה כב' הרשמת מרים סגל את בקשת המבקש, קבעה כי ההליכים מעוכבים מכוח החלטת בית המשפט הנכבד והפנתה אותו להחלטותיה מיום 19.8.2026 ומיום 17.9.2026 (נספח א'). ההכרעה נתונה אפוא לבית המשפט הנכבד בלבד.</w:t>
       </w:r>
     </w:p>
     <w:p>
@@ -321,7 +321,7 @@
           <w:szCs w:val="24"/>
           <w:rtl/>
         </w:rPr>
-        <w:t xml:space="preserve">להורות כי בתקופת העיכוב לא יוגדל החוב ולא יינקטו פעולות גבייה, ולבטל כל תוספת לחוב מיום 19.8.2026.</w:t>
+        <w:t xml:space="preserve">להורות כי בתקופת העיכוב לא יוגדל החוב ולא יינקטו פעולות גבייה, ולבטל כל תוספת לחוב מיום 18.8.2026.</w:t>
       </w:r>
     </w:p>
     <w:p>

</xml_diff>